<commit_message>
feat: implement Socio-Economic Phenomenon feature, responsive tables, regions, and imputation guides
</commit_message>
<xml_diff>
--- a/Rencana Pengembangan.docx
+++ b/Rencana Pengembangan.docx
@@ -1,6 +1,6 @@
 
 <file path=word/document.xml><?xml version="1.0" encoding="utf-8"?>
-<w:document xmlns:wpc="http://schemas.microsoft.com/office/word/2010/wordprocessingCanvas" xmlns:cx="http://schemas.microsoft.com/office/drawing/2014/chartex" xmlns:cx1="http://schemas.microsoft.com/office/drawing/2015/9/8/chartex" xmlns:cx2="http://schemas.microsoft.com/office/drawing/2015/10/21/chartex" xmlns:cx3="http://schemas.microsoft.com/office/drawing/2016/5/9/chartex" xmlns:cx4="http://schemas.microsoft.com/office/drawing/2016/5/10/chartex" xmlns:cx5="http://schemas.microsoft.com/office/drawing/2016/5/11/chartex" xmlns:cx6="http://schemas.microsoft.com/office/drawing/2016/5/12/chartex" xmlns:cx7="http://schemas.microsoft.com/office/drawing/2016/5/13/chartex" xmlns:cx8="http://schemas.microsoft.com/office/drawing/2016/5/14/chartex" xmlns:mc="http://schemas.openxmlformats.org/markup-compatibility/2006" xmlns:aink="http://schemas.microsoft.com/office/drawing/2016/ink" xmlns:am3d="http://schemas.microsoft.com/office/drawing/2017/model3d" xmlns:o="urn:schemas-microsoft-com:office:office" xmlns:oel="http://schemas.microsoft.com/office/2019/extlst" xmlns:r="http://schemas.openxmlformats.org/officeDocument/2006/relationships" xmlns:m="http://schemas.openxmlformats.org/officeDocument/2006/math" xmlns:v="urn:schemas-microsoft-com:vml" xmlns:wp14="http://schemas.microsoft.com/office/word/2010/wordprocessingDrawing" xmlns:wp="http://schemas.openxmlformats.org/drawingml/2006/wordprocessingDrawing" xmlns:w10="urn:schemas-microsoft-com:office:word" xmlns:w="http://schemas.openxmlformats.org/wordprocessingml/2006/main" xmlns:w14="http://schemas.microsoft.com/office/word/2010/wordml" xmlns:w15="http://schemas.microsoft.com/office/word/2012/wordml" xmlns:w16cex="http://schemas.microsoft.com/office/word/2018/wordml/cex" xmlns:w16cid="http://schemas.microsoft.com/office/word/2016/wordml/cid" xmlns:w16="http://schemas.microsoft.com/office/word/2018/wordml" xmlns:w16du="http://schemas.microsoft.com/office/word/2023/wordml/word16du" xmlns:w16sdtdh="http://schemas.microsoft.com/office/word/2020/wordml/sdtdatahash" xmlns:w16sdtfl="http://schemas.microsoft.com/office/word/2024/wordml/sdtformatlock" xmlns:w16se="http://schemas.microsoft.com/office/word/2015/wordml/symex" xmlns:wpg="http://schemas.microsoft.com/office/word/2010/wordprocessingGroup" xmlns:wpi="http://schemas.microsoft.com/office/word/2010/wordprocessingInk" xmlns:wne="http://schemas.microsoft.com/office/word/2006/wordml" xmlns:wps="http://schemas.microsoft.com/office/word/2010/wordprocessingShape" mc:Ignorable="w14 w15 w16se w16cid w16 w16cex w16sdtdh w16sdtfl w16du wp14">
+<w:document xmlns:wpc="http://schemas.microsoft.com/office/word/2010/wordprocessingCanvas" xmlns:cx="http://schemas.microsoft.com/office/drawing/2014/chartex" xmlns:cx1="http://schemas.microsoft.com/office/drawing/2015/9/8/chartex" xmlns:cx2="http://schemas.microsoft.com/office/drawing/2015/10/21/chartex" xmlns:cx3="http://schemas.microsoft.com/office/drawing/2016/5/9/chartex" xmlns:cx4="http://schemas.microsoft.com/office/drawing/2016/5/10/chartex" xmlns:cx5="http://schemas.microsoft.com/office/drawing/2016/5/11/chartex" xmlns:cx6="http://schemas.microsoft.com/office/drawing/2016/5/12/chartex" xmlns:cx7="http://schemas.microsoft.com/office/drawing/2016/5/13/chartex" xmlns:cx8="http://schemas.microsoft.com/office/drawing/2016/5/14/chartex" xmlns:mc="http://schemas.openxmlformats.org/markup-compatibility/2006" xmlns:aink="http://schemas.microsoft.com/office/drawing/2016/ink" xmlns:am3d="http://schemas.microsoft.com/office/drawing/2017/model3d" xmlns:o="urn:schemas-microsoft-com:office:office" xmlns:oel="http://schemas.microsoft.com/office/2019/extlst" xmlns:r="http://schemas.openxmlformats.org/officeDocument/2006/relationships" xmlns:m="http://schemas.openxmlformats.org/officeDocument/2006/math" xmlns:v="urn:schemas-microsoft-com:vml" xmlns:wp14="http://schemas.microsoft.com/office/word/2010/wordprocessingDrawing" xmlns:wp="http://schemas.openxmlformats.org/drawingml/2006/wordprocessingDrawing" xmlns:w10="urn:schemas-microsoft-com:office:word" xmlns:w="http://schemas.openxmlformats.org/wordprocessingml/2006/main" xmlns:w14="http://schemas.microsoft.com/office/word/2010/wordml" xmlns:w15="http://schemas.microsoft.com/office/word/2012/wordml" xmlns:w16cex="http://schemas.microsoft.com/office/word/2018/wordml/cex" xmlns:w16cid="http://schemas.microsoft.com/office/word/2016/wordml/cid" xmlns:w16="http://schemas.microsoft.com/office/word/2018/wordml" xmlns:w16sdtdh="http://schemas.microsoft.com/office/word/2020/wordml/sdtdatahash" xmlns:w16se="http://schemas.microsoft.com/office/word/2015/wordml/symex" xmlns:wpg="http://schemas.microsoft.com/office/word/2010/wordprocessingGroup" xmlns:wpi="http://schemas.microsoft.com/office/word/2010/wordprocessingInk" xmlns:wne="http://schemas.microsoft.com/office/word/2006/wordml" xmlns:wps="http://schemas.microsoft.com/office/word/2010/wordprocessingShape" mc:Ignorable="w14 w15 w16se w16cid w16 w16cex w16sdtdh wp14">
   <w:body>
     <w:p>
       <w:pPr>
@@ -58,23 +58,7 @@
         </w:numPr>
       </w:pPr>
       <w:r>
-        <w:t xml:space="preserve">Fitur ini terus dikembangkan seoptimal mungkin dengan memperkecil eror pada estimasi luas lantai. Ide besarnya adalah luas lantai rumah pada data DTSEN-SE digunakan sebagai data </w:t>
-      </w:r>
-      <w:proofErr w:type="spellStart"/>
-      <w:r>
-        <w:t>training</w:t>
-      </w:r>
-      <w:proofErr w:type="spellEnd"/>
-      <w:r>
-        <w:t xml:space="preserve"> atau basis data perhitungan </w:t>
-      </w:r>
-      <w:proofErr w:type="spellStart"/>
-      <w:r>
-        <w:t>pembobot</w:t>
-      </w:r>
-      <w:proofErr w:type="spellEnd"/>
-      <w:r>
-        <w:t xml:space="preserve"> luas lantai. Rencananya rata-rata luas lantai pada setiap RT akan dibandingkan dengan rata-rata luas atap pada setiap RT sehingga bisa didapatkan dalam setiap RT berapa perkiraan persentase luas lantai terhadap luas atap.</w:t>
+        <w:t>Fitur ini terus dikembangkan seoptimal mungkin dengan memperkecil eror pada estimasi luas lantai. Ide besarnya adalah luas lantai rumah pada data DTSEN-SE digunakan sebagai data training atau basis data perhitungan pembobot luas lantai. Rencananya rata-rata luas lantai pada setiap RT akan dibandingkan dengan rata-rata luas atap pada setiap RT sehingga bisa didapatkan dalam setiap RT berapa perkiraan persentase luas lantai terhadap luas atap.</w:t>
       </w:r>
     </w:p>
     <w:p>
@@ -98,41 +82,20 @@
         </w:numPr>
       </w:pPr>
       <w:r>
-        <w:t xml:space="preserve">Dengan basis data poligon rumah yang ada di Mempawah dan nilai </w:t>
-      </w:r>
-      <w:proofErr w:type="spellStart"/>
-      <w:r>
-        <w:t>pembobot</w:t>
-      </w:r>
-      <w:proofErr w:type="spellEnd"/>
-      <w:r>
-        <w:t xml:space="preserve"> estimasi luas lantai di setiap RT, sistem akan dikembangkan agar petugas dapat mengestimasi luas lantai dengan hanya mengeklik poligon rumah yang ada di Peta.</w:t>
-      </w:r>
-    </w:p>
-    <w:p>
-      <w:pPr>
-        <w:pStyle w:val="ListParagraph"/>
-        <w:numPr>
-          <w:ilvl w:val="1"/>
-          <w:numId w:val="1"/>
-        </w:numPr>
-      </w:pPr>
-      <w:r>
-        <w:t xml:space="preserve">Untuk pembaruan data, luas rumah dan poligon akan diperbarui pada saat </w:t>
-      </w:r>
-      <w:proofErr w:type="spellStart"/>
-      <w:r>
-        <w:t>Susenas</w:t>
-      </w:r>
-      <w:proofErr w:type="spellEnd"/>
-      <w:r>
-        <w:t xml:space="preserve"> Maret dan </w:t>
-      </w:r>
-      <w:proofErr w:type="spellStart"/>
-      <w:r>
-        <w:t>Supas</w:t>
-      </w:r>
-      <w:proofErr w:type="spellEnd"/>
+        <w:t>Dengan basis data poligon rumah yang ada di Mempawah dan nilai pembobot estimasi luas lantai di setiap RT, sistem akan dikembangkan agar petugas dapat mengestimasi luas lantai dengan hanya mengeklik poligon rumah yang ada di Peta.</w:t>
+      </w:r>
+    </w:p>
+    <w:p>
+      <w:pPr>
+        <w:pStyle w:val="ListParagraph"/>
+        <w:numPr>
+          <w:ilvl w:val="1"/>
+          <w:numId w:val="1"/>
+        </w:numPr>
+      </w:pPr>
+      <w:r>
+        <w:t>Untuk pembaruan data, luas rumah dan poligon akan diperbarui pada saat Susenas Maret dan Supas</w:t>
+      </w:r>
     </w:p>
     <w:p>
       <w:pPr>
@@ -163,31 +126,7 @@
         </w:numPr>
       </w:pPr>
       <w:r>
-        <w:t xml:space="preserve">Fitur ini berfungsi untuk menanggap fenomena </w:t>
-      </w:r>
-      <w:proofErr w:type="spellStart"/>
-      <w:r>
-        <w:t>ketenenagakerjaan</w:t>
-      </w:r>
-      <w:proofErr w:type="spellEnd"/>
-      <w:r>
-        <w:t xml:space="preserve"> pada setiap sampel SLS </w:t>
-      </w:r>
-      <w:proofErr w:type="spellStart"/>
-      <w:r>
-        <w:t>Sakernas</w:t>
-      </w:r>
-      <w:proofErr w:type="spellEnd"/>
-      <w:r>
-        <w:t xml:space="preserve"> dan fenomena kemiskinan pada setiap SLS sampel </w:t>
-      </w:r>
-      <w:proofErr w:type="spellStart"/>
-      <w:r>
-        <w:t>Susenas-Seruti</w:t>
-      </w:r>
-      <w:proofErr w:type="spellEnd"/>
-      <w:r>
-        <w:t>.</w:t>
+        <w:t>Fitur ini berfungsi untuk menanggap fenomena ketenenagakerjaan pada setiap sampel SLS Sakernas dan fenomena kemiskinan pada setiap SLS sampel Susenas-Seruti.</w:t>
       </w:r>
     </w:p>
     <w:p>
@@ -214,6 +153,18 @@
         </w:numPr>
       </w:pPr>
       <w:r>
+        <w:t>Setelah petugas atau admin menginputkan wilayah petugas atau admin memilih topik fenomena dalam bentuk dropdown yang terdiri dari ketenagakerjaan dan konsumsi rumah tangga</w:t>
+      </w:r>
+    </w:p>
+    <w:p>
+      <w:pPr>
+        <w:pStyle w:val="ListParagraph"/>
+        <w:numPr>
+          <w:ilvl w:val="1"/>
+          <w:numId w:val="1"/>
+        </w:numPr>
+      </w:pPr>
+      <w:r>
         <w:t>Penulisan SLS dan Nama petugas dibuat terbuka agar tidak memberatkan server</w:t>
       </w:r>
     </w:p>
@@ -226,209 +177,194 @@
         </w:numPr>
       </w:pPr>
       <w:r>
-        <w:t xml:space="preserve">Penulisan pertanyaan terbuka di buat </w:t>
-      </w:r>
-      <w:proofErr w:type="spellStart"/>
-      <w:r>
-        <w:t>capitalize</w:t>
-      </w:r>
-      <w:proofErr w:type="spellEnd"/>
-      <w:r>
-        <w:t xml:space="preserve"> oleh sistem</w:t>
-      </w:r>
-    </w:p>
-    <w:p>
-      <w:pPr>
-        <w:pStyle w:val="ListParagraph"/>
-        <w:numPr>
-          <w:ilvl w:val="1"/>
-          <w:numId w:val="1"/>
-        </w:numPr>
-      </w:pPr>
-      <w:r>
-        <w:t xml:space="preserve">Penulisan fenomena dapat dilakukan oleh </w:t>
-      </w:r>
-      <w:proofErr w:type="spellStart"/>
-      <w:r>
-        <w:t>role</w:t>
-      </w:r>
-      <w:proofErr w:type="spellEnd"/>
-      <w:r>
-        <w:t xml:space="preserve"> petugas dan admin</w:t>
-      </w:r>
-    </w:p>
-    <w:p>
-      <w:pPr>
-        <w:pStyle w:val="ListParagraph"/>
-        <w:numPr>
-          <w:ilvl w:val="1"/>
-          <w:numId w:val="1"/>
-        </w:numPr>
-      </w:pPr>
-      <w:r>
-        <w:t xml:space="preserve">Untuk </w:t>
-      </w:r>
-      <w:proofErr w:type="spellStart"/>
-      <w:r>
-        <w:t>role</w:t>
-      </w:r>
-      <w:proofErr w:type="spellEnd"/>
-      <w:r>
-        <w:t xml:space="preserve"> petugas, petugas harus menuliskan fenomena sampai level SLS. Jika ada SLS yang memiliki fenomena yang sama maka tulis ulang saja fenomenanya</w:t>
-      </w:r>
-    </w:p>
-    <w:p>
-      <w:pPr>
-        <w:pStyle w:val="ListParagraph"/>
-        <w:numPr>
-          <w:ilvl w:val="1"/>
-          <w:numId w:val="1"/>
-        </w:numPr>
-      </w:pPr>
-      <w:r>
-        <w:t xml:space="preserve">Untuk </w:t>
-      </w:r>
-      <w:proofErr w:type="spellStart"/>
-      <w:r>
-        <w:t>role</w:t>
-      </w:r>
-      <w:proofErr w:type="spellEnd"/>
-      <w:r>
-        <w:t xml:space="preserve"> admin penulisan fenomena dapat sampai level Kabupaten/Kecamatan/Desa dengan memberikan opsi Semua Kecamatan </w:t>
-      </w:r>
+        <w:t>Penulisan pertanyaan terbuka di buat capitalize oleh sistem</w:t>
+      </w:r>
+    </w:p>
+    <w:p>
+      <w:pPr>
+        <w:pStyle w:val="ListParagraph"/>
+        <w:numPr>
+          <w:ilvl w:val="1"/>
+          <w:numId w:val="1"/>
+        </w:numPr>
+      </w:pPr>
+      <w:r>
+        <w:t>Penulisan fenomena dapat dilakukan oleh role petugas dan admin</w:t>
+      </w:r>
+    </w:p>
+    <w:p>
+      <w:pPr>
+        <w:pStyle w:val="ListParagraph"/>
+        <w:numPr>
+          <w:ilvl w:val="1"/>
+          <w:numId w:val="1"/>
+        </w:numPr>
+      </w:pPr>
       <w:r>
         <w:lastRenderedPageBreak/>
-        <w:t xml:space="preserve">pada </w:t>
-      </w:r>
-      <w:proofErr w:type="spellStart"/>
-      <w:r>
-        <w:t>dropdown</w:t>
-      </w:r>
-      <w:proofErr w:type="spellEnd"/>
-      <w:r>
-        <w:t xml:space="preserve"> kecamatan, Semua desa pada </w:t>
-      </w:r>
-      <w:proofErr w:type="spellStart"/>
-      <w:r>
-        <w:t>dropdown</w:t>
-      </w:r>
-      <w:proofErr w:type="spellEnd"/>
-      <w:r>
-        <w:t xml:space="preserve"> Desa, dan Semua SLS pada </w:t>
-      </w:r>
-      <w:proofErr w:type="spellStart"/>
-      <w:r>
-        <w:t>dropdown</w:t>
-      </w:r>
-      <w:proofErr w:type="spellEnd"/>
-      <w:r>
-        <w:t xml:space="preserve"> SLS</w:t>
-      </w:r>
-    </w:p>
-    <w:p>
-      <w:pPr>
-        <w:pStyle w:val="ListParagraph"/>
-        <w:numPr>
-          <w:ilvl w:val="1"/>
-          <w:numId w:val="1"/>
-        </w:numPr>
-      </w:pPr>
-      <w:proofErr w:type="spellStart"/>
-      <w:r>
-        <w:t>Role</w:t>
-      </w:r>
-      <w:proofErr w:type="spellEnd"/>
-      <w:r>
-        <w:t xml:space="preserve"> petugas dan admin dapat melihat isian fenomena yang sudah diisi oleh petugas lain. Tetapi </w:t>
-      </w:r>
-      <w:proofErr w:type="spellStart"/>
-      <w:r>
-        <w:t>role</w:t>
-      </w:r>
-      <w:proofErr w:type="spellEnd"/>
-      <w:r>
-        <w:t xml:space="preserve"> petugas tidak bisa mengedit fenomena yang sudah </w:t>
-      </w:r>
-      <w:proofErr w:type="spellStart"/>
-      <w:r>
-        <w:t>disikan</w:t>
-      </w:r>
-      <w:proofErr w:type="spellEnd"/>
-      <w:r>
-        <w:t>, tapi kalo admin bisa.</w:t>
-      </w:r>
-    </w:p>
-    <w:p>
-      <w:pPr>
-        <w:pStyle w:val="ListParagraph"/>
-        <w:numPr>
-          <w:ilvl w:val="1"/>
-          <w:numId w:val="1"/>
-        </w:numPr>
-      </w:pPr>
-      <w:r>
-        <w:t xml:space="preserve">Nanti setiap selesai mengisi fenomena, sebelum dikirim ada centang pernyataan bahwa fenomena telah diisi sesuai kondisi yang sebenarnya, baru bisa di </w:t>
-      </w:r>
-      <w:proofErr w:type="spellStart"/>
-      <w:r>
-        <w:t>submit</w:t>
-      </w:r>
-      <w:proofErr w:type="spellEnd"/>
-      <w:r>
-        <w:t>.</w:t>
-      </w:r>
-    </w:p>
-    <w:p>
-      <w:pPr>
-        <w:pStyle w:val="ListParagraph"/>
-        <w:numPr>
-          <w:ilvl w:val="1"/>
-          <w:numId w:val="1"/>
-        </w:numPr>
-      </w:pPr>
-      <w:r>
-        <w:t xml:space="preserve">Tanggal </w:t>
-      </w:r>
-      <w:proofErr w:type="spellStart"/>
-      <w:r>
-        <w:t>submit</w:t>
-      </w:r>
-      <w:proofErr w:type="spellEnd"/>
-      <w:r>
-        <w:t xml:space="preserve"> akan otomatis tersimpan juga </w:t>
-      </w:r>
-      <w:proofErr w:type="spellStart"/>
-      <w:r>
-        <w:t>diserver</w:t>
-      </w:r>
-      <w:proofErr w:type="spellEnd"/>
-    </w:p>
-    <w:p>
-      <w:pPr>
-        <w:pStyle w:val="ListParagraph"/>
-        <w:numPr>
-          <w:ilvl w:val="1"/>
-          <w:numId w:val="1"/>
-        </w:numPr>
-      </w:pPr>
-      <w:r>
-        <w:t xml:space="preserve">Untuk </w:t>
-      </w:r>
-      <w:proofErr w:type="spellStart"/>
-      <w:r>
-        <w:t>role</w:t>
-      </w:r>
-      <w:proofErr w:type="spellEnd"/>
-      <w:r>
-        <w:t xml:space="preserve"> admin bisa menyimpulkan fenomena yang terjadi berdasarkan bulan dan jenis </w:t>
-      </w:r>
-      <w:proofErr w:type="spellStart"/>
-      <w:r>
-        <w:t>fenomenannya</w:t>
-      </w:r>
-      <w:proofErr w:type="spellEnd"/>
-      <w:r>
-        <w:t xml:space="preserve"> dengan integrasi ke Ai</w:t>
+        <w:t>Untuk role petugas, petugas harus menuliskan fenomena sampai level SLS. Jika ada SLS yang memiliki fenomena yang sama maka tulis ulang saja fenomenanya</w:t>
+      </w:r>
+    </w:p>
+    <w:p>
+      <w:pPr>
+        <w:pStyle w:val="ListParagraph"/>
+        <w:numPr>
+          <w:ilvl w:val="1"/>
+          <w:numId w:val="1"/>
+        </w:numPr>
+      </w:pPr>
+      <w:r>
+        <w:t>Untuk role admin penulisan fenomena dapat sampai level Kabupaten/Kecamatan/Desa dengan memberikan opsi Semua Kecamatan pada dropdown kecamatan, Semua desa pada dropdown Desa, dan Semua SLS pada dropdown SLS</w:t>
+      </w:r>
+    </w:p>
+    <w:p>
+      <w:pPr>
+        <w:pStyle w:val="ListParagraph"/>
+        <w:numPr>
+          <w:ilvl w:val="1"/>
+          <w:numId w:val="1"/>
+        </w:numPr>
+      </w:pPr>
+      <w:r>
+        <w:t>Role petugas dan admin dapat melihat isian fenomena yang sudah diisi oleh petugas lain. Tetapi role petugas tidak bisa mengedit fenomena yang sudah disikan, tapi kalo admin bisa.</w:t>
+      </w:r>
+    </w:p>
+    <w:p>
+      <w:pPr>
+        <w:pStyle w:val="ListParagraph"/>
+        <w:numPr>
+          <w:ilvl w:val="1"/>
+          <w:numId w:val="1"/>
+        </w:numPr>
+      </w:pPr>
+      <w:r>
+        <w:t>Nanti setiap selesai mengisi fenomena, sebelum dikirim ada centang pernyataan bahwa fenomena telah diisi sesuai kondisi yang sebenarnya, baru bisa di submit.</w:t>
+      </w:r>
+    </w:p>
+    <w:p>
+      <w:pPr>
+        <w:pStyle w:val="ListParagraph"/>
+        <w:numPr>
+          <w:ilvl w:val="1"/>
+          <w:numId w:val="1"/>
+        </w:numPr>
+      </w:pPr>
+      <w:r>
+        <w:t>Tanggal submit akan otomatis tersimpan juga diserver</w:t>
+      </w:r>
+    </w:p>
+    <w:p>
+      <w:pPr>
+        <w:pStyle w:val="ListParagraph"/>
+        <w:numPr>
+          <w:ilvl w:val="1"/>
+          <w:numId w:val="1"/>
+        </w:numPr>
+      </w:pPr>
+      <w:r>
+        <w:t xml:space="preserve">Untuk role admin bisa menyimpulkan fenomena yang terjadi berdasarkan bulan dan jenis fenomenannya dengan integrasi ke </w:t>
+      </w:r>
+      <w:r>
+        <w:t>gemini ai</w:t>
+      </w:r>
+    </w:p>
+    <w:p>
+      <w:pPr>
+        <w:pStyle w:val="ListParagraph"/>
+        <w:numPr>
+          <w:ilvl w:val="1"/>
+          <w:numId w:val="1"/>
+        </w:numPr>
+      </w:pPr>
+      <w:r>
+        <w:t>Pertanyaan pancingan untuk topik ketengakerjaan</w:t>
+      </w:r>
+    </w:p>
+    <w:p>
+      <w:pPr>
+        <w:pStyle w:val="ListParagraph"/>
+        <w:numPr>
+          <w:ilvl w:val="2"/>
+          <w:numId w:val="1"/>
+        </w:numPr>
+      </w:pPr>
+      <w:r>
+        <w:t>Kalau melihat warga di sini sehari-hari, biasanya mereka bekerja apa saja? Ceritakan yang paling sering ditemui</w:t>
+      </w:r>
+    </w:p>
+    <w:p>
+      <w:pPr>
+        <w:pStyle w:val="ListParagraph"/>
+        <w:numPr>
+          <w:ilvl w:val="2"/>
+          <w:numId w:val="1"/>
+        </w:numPr>
+      </w:pPr>
+      <w:r>
+        <w:t>Menurut Bapak/Ibu, sekarang mencari kerja di sini gampang atau susah? Biasanya kenapa bisa begitu</w:t>
+      </w:r>
+    </w:p>
+    <w:p>
+      <w:pPr>
+        <w:pStyle w:val="ListParagraph"/>
+        <w:numPr>
+          <w:ilvl w:val="2"/>
+          <w:numId w:val="1"/>
+        </w:numPr>
+      </w:pPr>
+      <w:r>
+        <w:t>Apakah ada perubahan pekerjaan warga dibanding dulu? Misalnya dulu banyak bertani, sekarang jadi ap</w:t>
+      </w:r>
+      <w:r>
+        <w:t>a?</w:t>
+      </w:r>
+    </w:p>
+    <w:p>
+      <w:pPr>
+        <w:pStyle w:val="ListParagraph"/>
+        <w:numPr>
+          <w:ilvl w:val="1"/>
+          <w:numId w:val="1"/>
+        </w:numPr>
+      </w:pPr>
+      <w:r>
+        <w:t>Pertanyaan pancingan untuk topik konsumsi rumah tangga</w:t>
+      </w:r>
+    </w:p>
+    <w:p>
+      <w:pPr>
+        <w:pStyle w:val="ListParagraph"/>
+        <w:numPr>
+          <w:ilvl w:val="2"/>
+          <w:numId w:val="1"/>
+        </w:numPr>
+      </w:pPr>
+      <w:r>
+        <w:t>Kalau kebutuhan rumah tangga sekarang dibanding beberapa tahun lalu, bagian mana yang paling terasa naik atau berubah pengeluarannya? Bisa diceritakan contohnya?</w:t>
+      </w:r>
+    </w:p>
+    <w:p>
+      <w:pPr>
+        <w:pStyle w:val="ListParagraph"/>
+        <w:numPr>
+          <w:ilvl w:val="2"/>
+          <w:numId w:val="1"/>
+        </w:numPr>
+      </w:pPr>
+      <w:r>
+        <w:t>Biasanya kalau penghasilan sedang berkurang atau harga naik, pengeluaran apa yang paling dulu dikurangi atau ditahan oleh keluarga di sini</w:t>
+      </w:r>
+    </w:p>
+    <w:p>
+      <w:pPr>
+        <w:pStyle w:val="ListParagraph"/>
+        <w:numPr>
+          <w:ilvl w:val="2"/>
+          <w:numId w:val="1"/>
+        </w:numPr>
+      </w:pPr>
+      <w:r>
+        <w:t>Menurut Bapak/Ibu, sekarang warga di sini lebih banyak membeli kebutuhan pokok, kebutuhan sekolah, cicilan, atau kebutuhan lain? Kenapa bisa begitu?</w:t>
       </w:r>
     </w:p>
     <w:p>
@@ -500,39 +436,7 @@
         </w:numPr>
       </w:pPr>
       <w:r>
-        <w:t xml:space="preserve">Pada fitur </w:t>
-      </w:r>
-      <w:proofErr w:type="spellStart"/>
-      <w:r>
-        <w:t>infra</w:t>
-      </w:r>
-      <w:proofErr w:type="spellEnd"/>
-      <w:r>
-        <w:t xml:space="preserve"> desa, KBLI KBJI berikan </w:t>
-      </w:r>
-      <w:proofErr w:type="spellStart"/>
-      <w:r>
-        <w:t>predefined</w:t>
-      </w:r>
-      <w:proofErr w:type="spellEnd"/>
-      <w:r>
-        <w:t xml:space="preserve"> data pada </w:t>
-      </w:r>
-      <w:proofErr w:type="spellStart"/>
-      <w:r>
-        <w:t>excel</w:t>
-      </w:r>
-      <w:proofErr w:type="spellEnd"/>
-      <w:r>
-        <w:t xml:space="preserve"> </w:t>
-      </w:r>
-      <w:proofErr w:type="spellStart"/>
-      <w:r>
-        <w:t>tempalte</w:t>
-      </w:r>
-      <w:proofErr w:type="spellEnd"/>
-      <w:r>
-        <w:t xml:space="preserve"> sebanyak 50 baris</w:t>
+        <w:t>Pada fitur infra desa, KBLI KBJI berikan predefined data pada excel tempalte sebanyak 50 baris</w:t>
       </w:r>
     </w:p>
     <w:sectPr>
@@ -546,7 +450,7 @@
 </file>
 
 <file path=word/numbering.xml><?xml version="1.0" encoding="utf-8"?>
-<w:numbering xmlns:wpc="http://schemas.microsoft.com/office/word/2010/wordprocessingCanvas" xmlns:cx="http://schemas.microsoft.com/office/drawing/2014/chartex" xmlns:cx1="http://schemas.microsoft.com/office/drawing/2015/9/8/chartex" xmlns:cx2="http://schemas.microsoft.com/office/drawing/2015/10/21/chartex" xmlns:cx3="http://schemas.microsoft.com/office/drawing/2016/5/9/chartex" xmlns:cx4="http://schemas.microsoft.com/office/drawing/2016/5/10/chartex" xmlns:cx5="http://schemas.microsoft.com/office/drawing/2016/5/11/chartex" xmlns:cx6="http://schemas.microsoft.com/office/drawing/2016/5/12/chartex" xmlns:cx7="http://schemas.microsoft.com/office/drawing/2016/5/13/chartex" xmlns:cx8="http://schemas.microsoft.com/office/drawing/2016/5/14/chartex" xmlns:mc="http://schemas.openxmlformats.org/markup-compatibility/2006" xmlns:aink="http://schemas.microsoft.com/office/drawing/2016/ink" xmlns:am3d="http://schemas.microsoft.com/office/drawing/2017/model3d" xmlns:o="urn:schemas-microsoft-com:office:office" xmlns:oel="http://schemas.microsoft.com/office/2019/extlst" xmlns:r="http://schemas.openxmlformats.org/officeDocument/2006/relationships" xmlns:m="http://schemas.openxmlformats.org/officeDocument/2006/math" xmlns:v="urn:schemas-microsoft-com:vml" xmlns:wp14="http://schemas.microsoft.com/office/word/2010/wordprocessingDrawing" xmlns:wp="http://schemas.openxmlformats.org/drawingml/2006/wordprocessingDrawing" xmlns:w10="urn:schemas-microsoft-com:office:word" xmlns:w="http://schemas.openxmlformats.org/wordprocessingml/2006/main" xmlns:w14="http://schemas.microsoft.com/office/word/2010/wordml" xmlns:w15="http://schemas.microsoft.com/office/word/2012/wordml" xmlns:w16cex="http://schemas.microsoft.com/office/word/2018/wordml/cex" xmlns:w16cid="http://schemas.microsoft.com/office/word/2016/wordml/cid" xmlns:w16="http://schemas.microsoft.com/office/word/2018/wordml" xmlns:w16du="http://schemas.microsoft.com/office/word/2023/wordml/word16du" xmlns:w16sdtdh="http://schemas.microsoft.com/office/word/2020/wordml/sdtdatahash" xmlns:w16sdtfl="http://schemas.microsoft.com/office/word/2024/wordml/sdtformatlock" xmlns:w16se="http://schemas.microsoft.com/office/word/2015/wordml/symex" xmlns:wpg="http://schemas.microsoft.com/office/word/2010/wordprocessingGroup" xmlns:wpi="http://schemas.microsoft.com/office/word/2010/wordprocessingInk" xmlns:wne="http://schemas.microsoft.com/office/word/2006/wordml" xmlns:wps="http://schemas.microsoft.com/office/word/2010/wordprocessingShape" mc:Ignorable="w14 w15 w16se w16cid w16 w16cex w16sdtdh w16sdtfl w16du wp14">
+<w:numbering xmlns:wpc="http://schemas.microsoft.com/office/word/2010/wordprocessingCanvas" xmlns:cx="http://schemas.microsoft.com/office/drawing/2014/chartex" xmlns:cx1="http://schemas.microsoft.com/office/drawing/2015/9/8/chartex" xmlns:cx2="http://schemas.microsoft.com/office/drawing/2015/10/21/chartex" xmlns:cx3="http://schemas.microsoft.com/office/drawing/2016/5/9/chartex" xmlns:cx4="http://schemas.microsoft.com/office/drawing/2016/5/10/chartex" xmlns:cx5="http://schemas.microsoft.com/office/drawing/2016/5/11/chartex" xmlns:cx6="http://schemas.microsoft.com/office/drawing/2016/5/12/chartex" xmlns:cx7="http://schemas.microsoft.com/office/drawing/2016/5/13/chartex" xmlns:cx8="http://schemas.microsoft.com/office/drawing/2016/5/14/chartex" xmlns:mc="http://schemas.openxmlformats.org/markup-compatibility/2006" xmlns:aink="http://schemas.microsoft.com/office/drawing/2016/ink" xmlns:am3d="http://schemas.microsoft.com/office/drawing/2017/model3d" xmlns:o="urn:schemas-microsoft-com:office:office" xmlns:oel="http://schemas.microsoft.com/office/2019/extlst" xmlns:r="http://schemas.openxmlformats.org/officeDocument/2006/relationships" xmlns:m="http://schemas.openxmlformats.org/officeDocument/2006/math" xmlns:v="urn:schemas-microsoft-com:vml" xmlns:wp14="http://schemas.microsoft.com/office/word/2010/wordprocessingDrawing" xmlns:wp="http://schemas.openxmlformats.org/drawingml/2006/wordprocessingDrawing" xmlns:w10="urn:schemas-microsoft-com:office:word" xmlns:w="http://schemas.openxmlformats.org/wordprocessingml/2006/main" xmlns:w14="http://schemas.microsoft.com/office/word/2010/wordml" xmlns:w15="http://schemas.microsoft.com/office/word/2012/wordml" xmlns:w16cex="http://schemas.microsoft.com/office/word/2018/wordml/cex" xmlns:w16cid="http://schemas.microsoft.com/office/word/2016/wordml/cid" xmlns:w16="http://schemas.microsoft.com/office/word/2018/wordml" xmlns:w16sdtdh="http://schemas.microsoft.com/office/word/2020/wordml/sdtdatahash" xmlns:w16se="http://schemas.microsoft.com/office/word/2015/wordml/symex" xmlns:wpg="http://schemas.microsoft.com/office/word/2010/wordprocessingGroup" xmlns:wpi="http://schemas.microsoft.com/office/word/2010/wordprocessingInk" xmlns:wne="http://schemas.microsoft.com/office/word/2006/wordml" xmlns:wps="http://schemas.microsoft.com/office/word/2010/wordprocessingShape" mc:Ignorable="w14 w15 w16se w16cid w16 w16cex w16sdtdh wp14">
   <w:abstractNum w:abstractNumId="0" w15:restartNumberingAfterBreak="0">
     <w:nsid w:val="21B9734C"/>
     <w:multiLevelType w:val="hybridMultilevel"/>
@@ -572,7 +476,7 @@
         <w:ind w:left="1440" w:hanging="360"/>
       </w:pPr>
     </w:lvl>
-    <w:lvl w:ilvl="2" w:tplc="0421001B" w:tentative="1">
+    <w:lvl w:ilvl="2" w:tplc="0421001B">
       <w:start w:val="1"/>
       <w:numFmt w:val="lowerRoman"/>
       <w:lvlText w:val="%3."/>
@@ -643,7 +547,7 @@
 </file>
 
 <file path=word/styles.xml><?xml version="1.0" encoding="utf-8"?>
-<w:styles xmlns:mc="http://schemas.openxmlformats.org/markup-compatibility/2006" xmlns:r="http://schemas.openxmlformats.org/officeDocument/2006/relationships" xmlns:w="http://schemas.openxmlformats.org/wordprocessingml/2006/main" xmlns:w14="http://schemas.microsoft.com/office/word/2010/wordml" xmlns:w15="http://schemas.microsoft.com/office/word/2012/wordml" xmlns:w16cex="http://schemas.microsoft.com/office/word/2018/wordml/cex" xmlns:w16cid="http://schemas.microsoft.com/office/word/2016/wordml/cid" xmlns:w16="http://schemas.microsoft.com/office/word/2018/wordml" xmlns:w16du="http://schemas.microsoft.com/office/word/2023/wordml/word16du" xmlns:w16sdtdh="http://schemas.microsoft.com/office/word/2020/wordml/sdtdatahash" xmlns:w16sdtfl="http://schemas.microsoft.com/office/word/2024/wordml/sdtformatlock" xmlns:w16se="http://schemas.microsoft.com/office/word/2015/wordml/symex" mc:Ignorable="w14 w15 w16se w16cid w16 w16cex w16sdtdh w16sdtfl w16du">
+<w:styles xmlns:mc="http://schemas.openxmlformats.org/markup-compatibility/2006" xmlns:r="http://schemas.openxmlformats.org/officeDocument/2006/relationships" xmlns:w="http://schemas.openxmlformats.org/wordprocessingml/2006/main" xmlns:w14="http://schemas.microsoft.com/office/word/2010/wordml" xmlns:w15="http://schemas.microsoft.com/office/word/2012/wordml" xmlns:w16cex="http://schemas.microsoft.com/office/word/2018/wordml/cex" xmlns:w16cid="http://schemas.microsoft.com/office/word/2016/wordml/cid" xmlns:w16="http://schemas.microsoft.com/office/word/2018/wordml" xmlns:w16sdtdh="http://schemas.microsoft.com/office/word/2020/wordml/sdtdatahash" xmlns:w16se="http://schemas.microsoft.com/office/word/2015/wordml/symex" mc:Ignorable="w14 w15 w16se w16cid w16 w16cex w16sdtdh">
   <w:docDefaults>
     <w:rPrDefault>
       <w:rPr>
@@ -1245,7 +1149,6 @@
   <w:style w:type="character" w:default="1" w:styleId="DefaultParagraphFont">
     <w:name w:val="Default Paragraph Font"/>
     <w:uiPriority w:val="1"/>
-    <w:semiHidden/>
     <w:unhideWhenUsed/>
   </w:style>
   <w:style w:type="table" w:default="1" w:styleId="TableNormal">

</xml_diff>

<commit_message>
feat: implement monitoring interactive dashboard
</commit_message>
<xml_diff>
--- a/Rencana Pengembangan.docx
+++ b/Rencana Pengembangan.docx
@@ -58,7 +58,23 @@
         </w:numPr>
       </w:pPr>
       <w:r>
-        <w:t>Fitur ini terus dikembangkan seoptimal mungkin dengan memperkecil eror pada estimasi luas lantai. Ide besarnya adalah luas lantai rumah pada data DTSEN-SE digunakan sebagai data training atau basis data perhitungan pembobot luas lantai. Rencananya rata-rata luas lantai pada setiap RT akan dibandingkan dengan rata-rata luas atap pada setiap RT sehingga bisa didapatkan dalam setiap RT berapa perkiraan persentase luas lantai terhadap luas atap.</w:t>
+        <w:t xml:space="preserve">Fitur ini terus dikembangkan seoptimal mungkin dengan memperkecil eror pada estimasi luas lantai. Ide besarnya adalah luas lantai rumah pada data DTSEN-SE digunakan sebagai data </w:t>
+      </w:r>
+      <w:proofErr w:type="spellStart"/>
+      <w:r>
+        <w:t>training</w:t>
+      </w:r>
+      <w:proofErr w:type="spellEnd"/>
+      <w:r>
+        <w:t xml:space="preserve"> atau basis data perhitungan </w:t>
+      </w:r>
+      <w:proofErr w:type="spellStart"/>
+      <w:r>
+        <w:t>pembobot</w:t>
+      </w:r>
+      <w:proofErr w:type="spellEnd"/>
+      <w:r>
+        <w:t xml:space="preserve"> luas lantai. Rencananya rata-rata luas lantai pada setiap RT akan dibandingkan dengan rata-rata luas atap pada setiap RT sehingga bisa didapatkan dalam setiap RT berapa perkiraan persentase luas lantai terhadap luas atap.</w:t>
       </w:r>
     </w:p>
     <w:p>
@@ -82,20 +98,41 @@
         </w:numPr>
       </w:pPr>
       <w:r>
-        <w:t>Dengan basis data poligon rumah yang ada di Mempawah dan nilai pembobot estimasi luas lantai di setiap RT, sistem akan dikembangkan agar petugas dapat mengestimasi luas lantai dengan hanya mengeklik poligon rumah yang ada di Peta.</w:t>
-      </w:r>
-    </w:p>
-    <w:p>
-      <w:pPr>
-        <w:pStyle w:val="ListParagraph"/>
-        <w:numPr>
-          <w:ilvl w:val="1"/>
-          <w:numId w:val="1"/>
-        </w:numPr>
-      </w:pPr>
-      <w:r>
-        <w:t>Untuk pembaruan data, luas rumah dan poligon akan diperbarui pada saat Susenas Maret dan Supas</w:t>
-      </w:r>
+        <w:t xml:space="preserve">Dengan basis data poligon rumah yang ada di Mempawah dan nilai </w:t>
+      </w:r>
+      <w:proofErr w:type="spellStart"/>
+      <w:r>
+        <w:t>pembobot</w:t>
+      </w:r>
+      <w:proofErr w:type="spellEnd"/>
+      <w:r>
+        <w:t xml:space="preserve"> estimasi luas lantai di setiap RT, sistem akan dikembangkan agar petugas dapat mengestimasi luas lantai dengan hanya mengeklik poligon rumah yang ada di Peta.</w:t>
+      </w:r>
+    </w:p>
+    <w:p>
+      <w:pPr>
+        <w:pStyle w:val="ListParagraph"/>
+        <w:numPr>
+          <w:ilvl w:val="1"/>
+          <w:numId w:val="1"/>
+        </w:numPr>
+      </w:pPr>
+      <w:r>
+        <w:t xml:space="preserve">Untuk pembaruan data, luas rumah dan poligon akan diperbarui pada saat </w:t>
+      </w:r>
+      <w:proofErr w:type="spellStart"/>
+      <w:r>
+        <w:t>Susenas</w:t>
+      </w:r>
+      <w:proofErr w:type="spellEnd"/>
+      <w:r>
+        <w:t xml:space="preserve"> Maret dan </w:t>
+      </w:r>
+      <w:proofErr w:type="spellStart"/>
+      <w:r>
+        <w:t>Supas</w:t>
+      </w:r>
+      <w:proofErr w:type="spellEnd"/>
     </w:p>
     <w:p>
       <w:pPr>
@@ -126,7 +163,31 @@
         </w:numPr>
       </w:pPr>
       <w:r>
-        <w:t>Fitur ini berfungsi untuk menanggap fenomena ketenenagakerjaan pada setiap sampel SLS Sakernas dan fenomena kemiskinan pada setiap SLS sampel Susenas-Seruti.</w:t>
+        <w:t xml:space="preserve">Fitur ini berfungsi untuk menanggap fenomena </w:t>
+      </w:r>
+      <w:proofErr w:type="spellStart"/>
+      <w:r>
+        <w:t>ketenenagakerjaan</w:t>
+      </w:r>
+      <w:proofErr w:type="spellEnd"/>
+      <w:r>
+        <w:t xml:space="preserve"> pada setiap sampel SLS </w:t>
+      </w:r>
+      <w:proofErr w:type="spellStart"/>
+      <w:r>
+        <w:t>Sakernas</w:t>
+      </w:r>
+      <w:proofErr w:type="spellEnd"/>
+      <w:r>
+        <w:t xml:space="preserve"> dan fenomena kemiskinan pada setiap SLS sampel </w:t>
+      </w:r>
+      <w:proofErr w:type="spellStart"/>
+      <w:r>
+        <w:t>Susenas-Seruti</w:t>
+      </w:r>
+      <w:proofErr w:type="spellEnd"/>
+      <w:r>
+        <w:t>.</w:t>
       </w:r>
     </w:p>
     <w:p>
@@ -153,7 +214,23 @@
         </w:numPr>
       </w:pPr>
       <w:r>
-        <w:t>Setelah petugas atau admin menginputkan wilayah petugas atau admin memilih topik fenomena dalam bentuk dropdown yang terdiri dari ketenagakerjaan dan konsumsi rumah tangga</w:t>
+        <w:t xml:space="preserve">Setelah petugas atau admin </w:t>
+      </w:r>
+      <w:proofErr w:type="spellStart"/>
+      <w:r>
+        <w:t>menginputkan</w:t>
+      </w:r>
+      <w:proofErr w:type="spellEnd"/>
+      <w:r>
+        <w:t xml:space="preserve"> wilayah petugas atau admin memilih topik fenomena dalam bentuk </w:t>
+      </w:r>
+      <w:proofErr w:type="spellStart"/>
+      <w:r>
+        <w:t>dropdown</w:t>
+      </w:r>
+      <w:proofErr w:type="spellEnd"/>
+      <w:r>
+        <w:t xml:space="preserve"> yang terdiri dari ketenagakerjaan dan konsumsi rumah tangga</w:t>
       </w:r>
     </w:p>
     <w:p>
@@ -177,19 +254,35 @@
         </w:numPr>
       </w:pPr>
       <w:r>
-        <w:t>Penulisan pertanyaan terbuka di buat capitalize oleh sistem</w:t>
-      </w:r>
-    </w:p>
-    <w:p>
-      <w:pPr>
-        <w:pStyle w:val="ListParagraph"/>
-        <w:numPr>
-          <w:ilvl w:val="1"/>
-          <w:numId w:val="1"/>
-        </w:numPr>
-      </w:pPr>
-      <w:r>
-        <w:t>Penulisan fenomena dapat dilakukan oleh role petugas dan admin</w:t>
+        <w:t xml:space="preserve">Penulisan pertanyaan terbuka di buat </w:t>
+      </w:r>
+      <w:proofErr w:type="spellStart"/>
+      <w:r>
+        <w:t>capitalize</w:t>
+      </w:r>
+      <w:proofErr w:type="spellEnd"/>
+      <w:r>
+        <w:t xml:space="preserve"> oleh sistem</w:t>
+      </w:r>
+    </w:p>
+    <w:p>
+      <w:pPr>
+        <w:pStyle w:val="ListParagraph"/>
+        <w:numPr>
+          <w:ilvl w:val="1"/>
+          <w:numId w:val="1"/>
+        </w:numPr>
+      </w:pPr>
+      <w:r>
+        <w:t xml:space="preserve">Penulisan fenomena dapat dilakukan oleh </w:t>
+      </w:r>
+      <w:proofErr w:type="spellStart"/>
+      <w:r>
+        <w:t>role</w:t>
+      </w:r>
+      <w:proofErr w:type="spellEnd"/>
+      <w:r>
+        <w:t xml:space="preserve"> petugas dan admin</w:t>
       </w:r>
     </w:p>
     <w:p>
@@ -202,83 +295,196 @@
       </w:pPr>
       <w:r>
         <w:lastRenderedPageBreak/>
-        <w:t>Untuk role petugas, petugas harus menuliskan fenomena sampai level SLS. Jika ada SLS yang memiliki fenomena yang sama maka tulis ulang saja fenomenanya</w:t>
-      </w:r>
-    </w:p>
-    <w:p>
-      <w:pPr>
-        <w:pStyle w:val="ListParagraph"/>
-        <w:numPr>
-          <w:ilvl w:val="1"/>
-          <w:numId w:val="1"/>
-        </w:numPr>
-      </w:pPr>
-      <w:r>
-        <w:t>Untuk role admin penulisan fenomena dapat sampai level Kabupaten/Kecamatan/Desa dengan memberikan opsi Semua Kecamatan pada dropdown kecamatan, Semua desa pada dropdown Desa, dan Semua SLS pada dropdown SLS</w:t>
-      </w:r>
-    </w:p>
-    <w:p>
-      <w:pPr>
-        <w:pStyle w:val="ListParagraph"/>
-        <w:numPr>
-          <w:ilvl w:val="1"/>
-          <w:numId w:val="1"/>
-        </w:numPr>
-      </w:pPr>
-      <w:r>
-        <w:t>Role petugas dan admin dapat melihat isian fenomena yang sudah diisi oleh petugas lain. Tetapi role petugas tidak bisa mengedit fenomena yang sudah disikan, tapi kalo admin bisa.</w:t>
-      </w:r>
-    </w:p>
-    <w:p>
-      <w:pPr>
-        <w:pStyle w:val="ListParagraph"/>
-        <w:numPr>
-          <w:ilvl w:val="1"/>
-          <w:numId w:val="1"/>
-        </w:numPr>
-      </w:pPr>
-      <w:r>
-        <w:t>Nanti setiap selesai mengisi fenomena, sebelum dikirim ada centang pernyataan bahwa fenomena telah diisi sesuai kondisi yang sebenarnya, baru bisa di submit.</w:t>
-      </w:r>
-    </w:p>
-    <w:p>
-      <w:pPr>
-        <w:pStyle w:val="ListParagraph"/>
-        <w:numPr>
-          <w:ilvl w:val="1"/>
-          <w:numId w:val="1"/>
-        </w:numPr>
-      </w:pPr>
-      <w:r>
-        <w:t>Tanggal submit akan otomatis tersimpan juga diserver</w:t>
-      </w:r>
-    </w:p>
-    <w:p>
-      <w:pPr>
-        <w:pStyle w:val="ListParagraph"/>
-        <w:numPr>
-          <w:ilvl w:val="1"/>
-          <w:numId w:val="1"/>
-        </w:numPr>
-      </w:pPr>
-      <w:r>
-        <w:t xml:space="preserve">Untuk role admin bisa menyimpulkan fenomena yang terjadi berdasarkan bulan dan jenis fenomenannya dengan integrasi ke </w:t>
-      </w:r>
-      <w:r>
-        <w:t>gemini ai</w:t>
-      </w:r>
-    </w:p>
-    <w:p>
-      <w:pPr>
-        <w:pStyle w:val="ListParagraph"/>
-        <w:numPr>
-          <w:ilvl w:val="1"/>
-          <w:numId w:val="1"/>
-        </w:numPr>
-      </w:pPr>
-      <w:r>
-        <w:t>Pertanyaan pancingan untuk topik ketengakerjaan</w:t>
-      </w:r>
+        <w:t xml:space="preserve">Untuk </w:t>
+      </w:r>
+      <w:proofErr w:type="spellStart"/>
+      <w:r>
+        <w:t>role</w:t>
+      </w:r>
+      <w:proofErr w:type="spellEnd"/>
+      <w:r>
+        <w:t xml:space="preserve"> petugas, petugas harus menuliskan fenomena sampai level SLS. Jika ada SLS yang memiliki fenomena yang sama maka tulis ulang saja fenomenanya</w:t>
+      </w:r>
+    </w:p>
+    <w:p>
+      <w:pPr>
+        <w:pStyle w:val="ListParagraph"/>
+        <w:numPr>
+          <w:ilvl w:val="1"/>
+          <w:numId w:val="1"/>
+        </w:numPr>
+      </w:pPr>
+      <w:r>
+        <w:t xml:space="preserve">Untuk </w:t>
+      </w:r>
+      <w:proofErr w:type="spellStart"/>
+      <w:r>
+        <w:t>role</w:t>
+      </w:r>
+      <w:proofErr w:type="spellEnd"/>
+      <w:r>
+        <w:t xml:space="preserve"> admin penulisan fenomena dapat sampai level Kabupaten/Kecamatan/Desa dengan memberikan opsi Semua Kecamatan pada </w:t>
+      </w:r>
+      <w:proofErr w:type="spellStart"/>
+      <w:r>
+        <w:t>dropdown</w:t>
+      </w:r>
+      <w:proofErr w:type="spellEnd"/>
+      <w:r>
+        <w:t xml:space="preserve"> kecamatan, Semua desa pada </w:t>
+      </w:r>
+      <w:proofErr w:type="spellStart"/>
+      <w:r>
+        <w:t>dropdown</w:t>
+      </w:r>
+      <w:proofErr w:type="spellEnd"/>
+      <w:r>
+        <w:t xml:space="preserve"> Desa, dan Semua SLS pada </w:t>
+      </w:r>
+      <w:proofErr w:type="spellStart"/>
+      <w:r>
+        <w:t>dropdown</w:t>
+      </w:r>
+      <w:proofErr w:type="spellEnd"/>
+      <w:r>
+        <w:t xml:space="preserve"> SLS</w:t>
+      </w:r>
+    </w:p>
+    <w:p>
+      <w:pPr>
+        <w:pStyle w:val="ListParagraph"/>
+        <w:numPr>
+          <w:ilvl w:val="1"/>
+          <w:numId w:val="1"/>
+        </w:numPr>
+      </w:pPr>
+      <w:proofErr w:type="spellStart"/>
+      <w:r>
+        <w:t>Role</w:t>
+      </w:r>
+      <w:proofErr w:type="spellEnd"/>
+      <w:r>
+        <w:t xml:space="preserve"> petugas dan admin dapat melihat isian fenomena yang sudah diisi oleh petugas lain. Tetapi </w:t>
+      </w:r>
+      <w:proofErr w:type="spellStart"/>
+      <w:r>
+        <w:t>role</w:t>
+      </w:r>
+      <w:proofErr w:type="spellEnd"/>
+      <w:r>
+        <w:t xml:space="preserve"> petugas tidak bisa mengedit fenomena yang sudah </w:t>
+      </w:r>
+      <w:proofErr w:type="spellStart"/>
+      <w:r>
+        <w:t>disikan</w:t>
+      </w:r>
+      <w:proofErr w:type="spellEnd"/>
+      <w:r>
+        <w:t>, tapi kalo admin bisa.</w:t>
+      </w:r>
+    </w:p>
+    <w:p>
+      <w:pPr>
+        <w:pStyle w:val="ListParagraph"/>
+        <w:numPr>
+          <w:ilvl w:val="1"/>
+          <w:numId w:val="1"/>
+        </w:numPr>
+      </w:pPr>
+      <w:r>
+        <w:t xml:space="preserve">Nanti setiap selesai mengisi fenomena, sebelum dikirim ada centang pernyataan bahwa fenomena telah diisi sesuai kondisi yang sebenarnya, baru bisa di </w:t>
+      </w:r>
+      <w:proofErr w:type="spellStart"/>
+      <w:r>
+        <w:t>submit</w:t>
+      </w:r>
+      <w:proofErr w:type="spellEnd"/>
+      <w:r>
+        <w:t>.</w:t>
+      </w:r>
+    </w:p>
+    <w:p>
+      <w:pPr>
+        <w:pStyle w:val="ListParagraph"/>
+        <w:numPr>
+          <w:ilvl w:val="1"/>
+          <w:numId w:val="1"/>
+        </w:numPr>
+      </w:pPr>
+      <w:r>
+        <w:t xml:space="preserve">Tanggal </w:t>
+      </w:r>
+      <w:proofErr w:type="spellStart"/>
+      <w:r>
+        <w:t>submit</w:t>
+      </w:r>
+      <w:proofErr w:type="spellEnd"/>
+      <w:r>
+        <w:t xml:space="preserve"> akan otomatis tersimpan juga </w:t>
+      </w:r>
+      <w:proofErr w:type="spellStart"/>
+      <w:r>
+        <w:t>diserver</w:t>
+      </w:r>
+      <w:proofErr w:type="spellEnd"/>
+    </w:p>
+    <w:p>
+      <w:pPr>
+        <w:pStyle w:val="ListParagraph"/>
+        <w:numPr>
+          <w:ilvl w:val="1"/>
+          <w:numId w:val="1"/>
+        </w:numPr>
+      </w:pPr>
+      <w:r>
+        <w:t xml:space="preserve">Untuk </w:t>
+      </w:r>
+      <w:proofErr w:type="spellStart"/>
+      <w:r>
+        <w:t>role</w:t>
+      </w:r>
+      <w:proofErr w:type="spellEnd"/>
+      <w:r>
+        <w:t xml:space="preserve"> admin bisa menyimpulkan fenomena yang terjadi berdasarkan bulan dan jenis </w:t>
+      </w:r>
+      <w:proofErr w:type="spellStart"/>
+      <w:r>
+        <w:t>fenomenannya</w:t>
+      </w:r>
+      <w:proofErr w:type="spellEnd"/>
+      <w:r>
+        <w:t xml:space="preserve"> dengan integrasi ke </w:t>
+      </w:r>
+      <w:proofErr w:type="spellStart"/>
+      <w:r>
+        <w:t>gemini</w:t>
+      </w:r>
+      <w:proofErr w:type="spellEnd"/>
+      <w:r>
+        <w:t xml:space="preserve"> </w:t>
+      </w:r>
+      <w:proofErr w:type="spellStart"/>
+      <w:r>
+        <w:t>ai</w:t>
+      </w:r>
+      <w:proofErr w:type="spellEnd"/>
+    </w:p>
+    <w:p>
+      <w:pPr>
+        <w:pStyle w:val="ListParagraph"/>
+        <w:numPr>
+          <w:ilvl w:val="1"/>
+          <w:numId w:val="1"/>
+        </w:numPr>
+      </w:pPr>
+      <w:r>
+        <w:t xml:space="preserve">Pertanyaan pancingan untuk topik </w:t>
+      </w:r>
+      <w:proofErr w:type="spellStart"/>
+      <w:r>
+        <w:t>ketengakerjaan</w:t>
+      </w:r>
+      <w:proofErr w:type="spellEnd"/>
     </w:p>
     <w:p>
       <w:pPr>
@@ -436,7 +642,371 @@
         </w:numPr>
       </w:pPr>
       <w:r>
-        <w:t>Pada fitur infra desa, KBLI KBJI berikan predefined data pada excel tempalte sebanyak 50 baris</w:t>
+        <w:t xml:space="preserve">Pada fitur </w:t>
+      </w:r>
+      <w:proofErr w:type="spellStart"/>
+      <w:r>
+        <w:t>infra</w:t>
+      </w:r>
+      <w:proofErr w:type="spellEnd"/>
+      <w:r>
+        <w:t xml:space="preserve"> desa, KBLI KBJI berikan </w:t>
+      </w:r>
+      <w:proofErr w:type="spellStart"/>
+      <w:r>
+        <w:t>predefined</w:t>
+      </w:r>
+      <w:proofErr w:type="spellEnd"/>
+      <w:r>
+        <w:t xml:space="preserve"> data pada </w:t>
+      </w:r>
+      <w:proofErr w:type="spellStart"/>
+      <w:r>
+        <w:t>excel</w:t>
+      </w:r>
+      <w:proofErr w:type="spellEnd"/>
+      <w:r>
+        <w:t xml:space="preserve"> </w:t>
+      </w:r>
+      <w:proofErr w:type="spellStart"/>
+      <w:r>
+        <w:t>tempalte</w:t>
+      </w:r>
+      <w:proofErr w:type="spellEnd"/>
+      <w:r>
+        <w:t xml:space="preserve"> sebanyak 50 baris</w:t>
+      </w:r>
+    </w:p>
+    <w:p>
+      <w:pPr>
+        <w:pStyle w:val="ListParagraph"/>
+        <w:numPr>
+          <w:ilvl w:val="0"/>
+          <w:numId w:val="1"/>
+        </w:numPr>
+      </w:pPr>
+      <w:r>
+        <w:rPr>
+          <w:b/>
+          <w:bCs/>
+        </w:rPr>
+        <w:t>LMS (</w:t>
+      </w:r>
+      <w:proofErr w:type="spellStart"/>
+      <w:r>
+        <w:rPr>
+          <w:b/>
+          <w:bCs/>
+        </w:rPr>
+        <w:t>Learning</w:t>
+      </w:r>
+      <w:proofErr w:type="spellEnd"/>
+      <w:r>
+        <w:rPr>
+          <w:b/>
+          <w:bCs/>
+        </w:rPr>
+        <w:t xml:space="preserve"> Manajemen Sistem)</w:t>
+      </w:r>
+    </w:p>
+    <w:p>
+      <w:pPr>
+        <w:pStyle w:val="ListParagraph"/>
+        <w:numPr>
+          <w:ilvl w:val="1"/>
+          <w:numId w:val="1"/>
+        </w:numPr>
+      </w:pPr>
+      <w:r>
+        <w:lastRenderedPageBreak/>
+        <w:t xml:space="preserve">Admin dapat membuat jenis pelatihan dengan </w:t>
+      </w:r>
+      <w:proofErr w:type="spellStart"/>
+      <w:r>
+        <w:t>memasukan</w:t>
+      </w:r>
+      <w:proofErr w:type="spellEnd"/>
+      <w:r>
+        <w:t xml:space="preserve"> nama pelatihan dan periode pelatihan serta memilih </w:t>
+      </w:r>
+      <w:proofErr w:type="spellStart"/>
+      <w:r>
+        <w:t>icon</w:t>
+      </w:r>
+      <w:proofErr w:type="spellEnd"/>
+      <w:r>
+        <w:t xml:space="preserve"> pelatihan berdasarkan </w:t>
+      </w:r>
+      <w:proofErr w:type="spellStart"/>
+      <w:r>
+        <w:t>icon</w:t>
+      </w:r>
+      <w:proofErr w:type="spellEnd"/>
+      <w:r>
+        <w:t xml:space="preserve"> yang disediakan.</w:t>
+      </w:r>
+    </w:p>
+    <w:p>
+      <w:pPr>
+        <w:pStyle w:val="ListParagraph"/>
+        <w:numPr>
+          <w:ilvl w:val="1"/>
+          <w:numId w:val="1"/>
+        </w:numPr>
+      </w:pPr>
+      <w:r>
+        <w:t xml:space="preserve">Pilihan </w:t>
+      </w:r>
+      <w:proofErr w:type="spellStart"/>
+      <w:r>
+        <w:t>icon</w:t>
+      </w:r>
+      <w:proofErr w:type="spellEnd"/>
+      <w:r>
+        <w:t xml:space="preserve"> berupa </w:t>
+      </w:r>
+      <w:proofErr w:type="spellStart"/>
+      <w:r>
+        <w:t>icon</w:t>
+      </w:r>
+      <w:proofErr w:type="spellEnd"/>
+      <w:r>
+        <w:t xml:space="preserve"> </w:t>
+      </w:r>
+      <w:proofErr w:type="spellStart"/>
+      <w:r>
+        <w:t>ketenagakerjaa</w:t>
+      </w:r>
+      <w:proofErr w:type="spellEnd"/>
+      <w:r>
+        <w:t xml:space="preserve">, </w:t>
+      </w:r>
+      <w:proofErr w:type="spellStart"/>
+      <w:r>
+        <w:t>icon</w:t>
+      </w:r>
+      <w:proofErr w:type="spellEnd"/>
+      <w:r>
+        <w:t xml:space="preserve"> sosial, </w:t>
+      </w:r>
+      <w:proofErr w:type="spellStart"/>
+      <w:r>
+        <w:t>icon</w:t>
+      </w:r>
+      <w:proofErr w:type="spellEnd"/>
+      <w:r>
+        <w:t xml:space="preserve"> ekonomi, </w:t>
+      </w:r>
+      <w:proofErr w:type="spellStart"/>
+      <w:r>
+        <w:t>icon</w:t>
+      </w:r>
+      <w:proofErr w:type="spellEnd"/>
+      <w:r>
+        <w:t xml:space="preserve"> pertanian, </w:t>
+      </w:r>
+      <w:proofErr w:type="spellStart"/>
+      <w:r>
+        <w:t>icon</w:t>
+      </w:r>
+      <w:proofErr w:type="spellEnd"/>
+      <w:r>
+        <w:t xml:space="preserve"> produksi, </w:t>
+      </w:r>
+      <w:proofErr w:type="spellStart"/>
+      <w:r>
+        <w:t>icon</w:t>
+      </w:r>
+      <w:proofErr w:type="spellEnd"/>
+      <w:r>
+        <w:t xml:space="preserve"> pengolahan, </w:t>
+      </w:r>
+      <w:proofErr w:type="spellStart"/>
+      <w:r>
+        <w:t>icon</w:t>
+      </w:r>
+      <w:proofErr w:type="spellEnd"/>
+      <w:r>
+        <w:t xml:space="preserve"> harga, </w:t>
+      </w:r>
+      <w:proofErr w:type="spellStart"/>
+      <w:r>
+        <w:t>icon</w:t>
+      </w:r>
+      <w:proofErr w:type="spellEnd"/>
+      <w:r>
+        <w:t xml:space="preserve"> distribusi, </w:t>
+      </w:r>
+      <w:proofErr w:type="spellStart"/>
+      <w:r>
+        <w:t>icon</w:t>
+      </w:r>
+      <w:proofErr w:type="spellEnd"/>
+      <w:r>
+        <w:t xml:space="preserve"> analisis, </w:t>
+      </w:r>
+      <w:proofErr w:type="spellStart"/>
+      <w:r>
+        <w:t>icon</w:t>
+      </w:r>
+      <w:proofErr w:type="spellEnd"/>
+      <w:r>
+        <w:t xml:space="preserve"> pemerintahan, </w:t>
+      </w:r>
+      <w:proofErr w:type="spellStart"/>
+      <w:r>
+        <w:t>icon</w:t>
+      </w:r>
+      <w:proofErr w:type="spellEnd"/>
+      <w:r>
+        <w:t xml:space="preserve"> pendidikan, </w:t>
+      </w:r>
+      <w:proofErr w:type="spellStart"/>
+      <w:r>
+        <w:t>icon</w:t>
+      </w:r>
+      <w:proofErr w:type="spellEnd"/>
+      <w:r>
+        <w:t xml:space="preserve"> peternakan, </w:t>
+      </w:r>
+      <w:proofErr w:type="spellStart"/>
+      <w:r>
+        <w:t>icon</w:t>
+      </w:r>
+      <w:proofErr w:type="spellEnd"/>
+      <w:r>
+        <w:t xml:space="preserve"> teknologi.</w:t>
+      </w:r>
+    </w:p>
+    <w:p>
+      <w:pPr>
+        <w:pStyle w:val="ListParagraph"/>
+        <w:numPr>
+          <w:ilvl w:val="1"/>
+          <w:numId w:val="1"/>
+        </w:numPr>
+      </w:pPr>
+      <w:r>
+        <w:t xml:space="preserve">Admin dapat membuat tombol yang </w:t>
+      </w:r>
+      <w:proofErr w:type="spellStart"/>
+      <w:r>
+        <w:t>direct</w:t>
+      </w:r>
+      <w:proofErr w:type="spellEnd"/>
+      <w:r>
+        <w:t xml:space="preserve"> ke </w:t>
+      </w:r>
+      <w:proofErr w:type="spellStart"/>
+      <w:r>
+        <w:t>link</w:t>
+      </w:r>
+      <w:proofErr w:type="spellEnd"/>
+      <w:r>
+        <w:t xml:space="preserve"> yang dibutuhkan misalnya untuk </w:t>
+      </w:r>
+      <w:proofErr w:type="spellStart"/>
+      <w:r>
+        <w:t>link</w:t>
+      </w:r>
+      <w:proofErr w:type="spellEnd"/>
+      <w:r>
+        <w:t xml:space="preserve"> kuis, bahan ajar, instrumen pelatihan dll. pada setiap kegiatan yang sudah dibuat</w:t>
+      </w:r>
+    </w:p>
+    <w:p>
+      <w:pPr>
+        <w:pStyle w:val="ListParagraph"/>
+        <w:numPr>
+          <w:ilvl w:val="1"/>
+          <w:numId w:val="1"/>
+        </w:numPr>
+      </w:pPr>
+      <w:r>
+        <w:t>Konsepnya admin dapat membuat tombol berdasarkan pengelompokan jenis elemen pelatihan seperti administrasi, materi dan instrumen pelatihan, jadwal pelatihan, dan kuis dan pendalaman.</w:t>
+      </w:r>
+    </w:p>
+    <w:p>
+      <w:pPr>
+        <w:pStyle w:val="ListParagraph"/>
+        <w:numPr>
+          <w:ilvl w:val="1"/>
+          <w:numId w:val="1"/>
+        </w:numPr>
+      </w:pPr>
+      <w:r>
+        <w:t>Pada tombol tersebut admin bisa membuka atau menutup akses kegiatan dan akses tombol.</w:t>
+      </w:r>
+    </w:p>
+    <w:p>
+      <w:pPr>
+        <w:pStyle w:val="ListParagraph"/>
+        <w:numPr>
+          <w:ilvl w:val="1"/>
+          <w:numId w:val="1"/>
+        </w:numPr>
+      </w:pPr>
+      <w:r>
+        <w:t xml:space="preserve">Pada </w:t>
+      </w:r>
+      <w:proofErr w:type="spellStart"/>
+      <w:r>
+        <w:t>role</w:t>
+      </w:r>
+      <w:proofErr w:type="spellEnd"/>
+      <w:r>
+        <w:t xml:space="preserve"> admin bisa melihat pelatihan apa saja yang sedang aktif dan dapat menon aktifkan dengan menutup akses petugas</w:t>
+      </w:r>
+    </w:p>
+    <w:p>
+      <w:pPr>
+        <w:pStyle w:val="ListParagraph"/>
+        <w:numPr>
+          <w:ilvl w:val="1"/>
+          <w:numId w:val="1"/>
+        </w:numPr>
+      </w:pPr>
+      <w:r>
+        <w:t xml:space="preserve">Pada </w:t>
+      </w:r>
+      <w:proofErr w:type="spellStart"/>
+      <w:r>
+        <w:t>role</w:t>
+      </w:r>
+      <w:proofErr w:type="spellEnd"/>
+      <w:r>
+        <w:t xml:space="preserve"> petugas, petugas dapat mengakses pelatihan dan tombol-tombol yang sudah dibuat.</w:t>
+      </w:r>
+    </w:p>
+    <w:p>
+      <w:pPr>
+        <w:pStyle w:val="ListParagraph"/>
+        <w:numPr>
+          <w:ilvl w:val="1"/>
+          <w:numId w:val="1"/>
+        </w:numPr>
+      </w:pPr>
+      <w:r>
+        <w:t xml:space="preserve">Agar petugas lebih mudah dalam mengaksesnya dengan </w:t>
+      </w:r>
+      <w:proofErr w:type="spellStart"/>
+      <w:r>
+        <w:t>hp</w:t>
+      </w:r>
+      <w:proofErr w:type="spellEnd"/>
+      <w:r>
+        <w:t xml:space="preserve"> UI </w:t>
+      </w:r>
+      <w:proofErr w:type="spellStart"/>
+      <w:r>
+        <w:t>nya</w:t>
+      </w:r>
+      <w:proofErr w:type="spellEnd"/>
+      <w:r>
+        <w:t xml:space="preserve"> dibuat pengelompokan menurut kegiatan, kemudian dalam setiap kegiatan dibuat pengelompokan menurut </w:t>
+      </w:r>
+      <w:r>
+        <w:t>elemen pelatihan</w:t>
       </w:r>
     </w:p>
     <w:sectPr>
@@ -1149,6 +1719,7 @@
   <w:style w:type="character" w:default="1" w:styleId="DefaultParagraphFont">
     <w:name w:val="Default Paragraph Font"/>
     <w:uiPriority w:val="1"/>
+    <w:semiHidden/>
     <w:unhideWhenUsed/>
   </w:style>
   <w:style w:type="table" w:default="1" w:styleId="TableNormal">

</xml_diff>